<commit_message>
Weekly Progress Report 9.
</commit_message>
<xml_diff>
--- a/Weekly Reports/WeeklyProgressReport-GroupB-Week9.docx
+++ b/Weekly Reports/WeeklyProgressReport-GroupB-Week9.docx
@@ -353,6 +353,14 @@
               </w:rPr>
               <w:t>Sakshi (C0908000)</w:t>
             </w:r>
+            <w:r>
+              <w:rPr>
+                <w:rFonts w:cstheme="minorHAnsi"/>
+                <w:b w:val="0"/>
+                <w:color w:val="548DD4" w:themeColor="text2" w:themeTint="99"/>
+              </w:rPr>
+              <w:t xml:space="preserve"> – TL</w:t>
+            </w:r>
           </w:p>
           <w:p>
             <w:pPr>
@@ -424,14 +432,6 @@
                 <w:color w:val="548DD4" w:themeColor="text2" w:themeTint="99"/>
               </w:rPr>
               <w:t>Rachit Bhatt (C0902810)</w:t>
-            </w:r>
-            <w:r>
-              <w:rPr>
-                <w:rFonts w:cstheme="minorHAnsi"/>
-                <w:b w:val="0"/>
-                <w:color w:val="548DD4" w:themeColor="text2" w:themeTint="99"/>
-              </w:rPr>
-              <w:t xml:space="preserve"> – TL</w:t>
             </w:r>
           </w:p>
         </w:tc>
@@ -529,18 +529,8 @@
                 <w:b w:val="0"/>
                 <w:color w:val="548DD4" w:themeColor="text2" w:themeTint="99"/>
               </w:rPr>
-              <w:t xml:space="preserve">William </w:t>
+              <w:t>William Pourmajidi</w:t>
             </w:r>
-            <w:proofErr w:type="spellStart"/>
-            <w:r>
-              <w:rPr>
-                <w:rFonts w:cstheme="minorHAnsi"/>
-                <w:b w:val="0"/>
-                <w:color w:val="548DD4" w:themeColor="text2" w:themeTint="99"/>
-              </w:rPr>
-              <w:t>Pourmajidi</w:t>
-            </w:r>
-            <w:proofErr w:type="spellEnd"/>
           </w:p>
         </w:tc>
       </w:tr>
@@ -1460,14 +1450,7 @@
           <w:b w:val="0"/>
           <w:bCs/>
         </w:rPr>
-        <w:t>t.</w:t>
-      </w:r>
-      <w:r>
-        <w:rPr>
-          <w:b w:val="0"/>
-          <w:bCs/>
-        </w:rPr>
-        <w:t xml:space="preserve"> Faced challenges while setting up CI/Cd workflows for multiple branches in Github, particularly in aligning Docker deployment with branch specific configurations. </w:t>
+        <w:t xml:space="preserve">Faced challenges while setting up CI/Cd workflows for multiple branches in Github, particularly in aligning Docker deployment with branch specific configurations. </w:t>
       </w:r>
     </w:p>
     <w:p>
@@ -1623,14 +1606,7 @@
           <w:b w:val="0"/>
           <w:bCs/>
         </w:rPr>
-        <w:t>I</w:t>
-      </w:r>
-      <w:r>
-        <w:rPr>
-          <w:b w:val="0"/>
-          <w:bCs/>
-        </w:rPr>
-        <w:t>nvestigate how GitHub Actions can be integrated into the project for automating testing and deployment.</w:t>
+        <w:t>Investigate how GitHub Actions can be integrated into the project for automating testing and deployment.</w:t>
       </w:r>
     </w:p>
     <w:p>
@@ -1802,7 +1778,6 @@
         </w:rPr>
         <w:t>/</w:t>
       </w:r>
-      <w:proofErr w:type="spellStart"/>
       <w:r>
         <w:rPr>
           <w:rFonts w:asciiTheme="minorHAnsi" w:hAnsiTheme="minorHAnsi" w:cstheme="minorHAnsi"/>
@@ -1827,7 +1802,6 @@
         </w:rPr>
         <w:t>ub</w:t>
       </w:r>
-      <w:proofErr w:type="spellEnd"/>
       <w:r>
         <w:rPr>
           <w:rFonts w:asciiTheme="minorHAnsi" w:hAnsiTheme="minorHAnsi" w:cstheme="minorHAnsi"/>
@@ -2017,25 +1991,7 @@
           <w:bCs w:val="0"/>
         </w:rPr>
         <w:lastRenderedPageBreak/>
-        <w:t>Include charts/graphs (e.g., burn down charts) from your project management tool (Github/</w:t>
-      </w:r>
-      <w:proofErr w:type="spellStart"/>
-      <w:r>
-        <w:rPr>
-          <w:rFonts w:asciiTheme="minorHAnsi" w:hAnsiTheme="minorHAnsi" w:cstheme="minorHAnsi"/>
-          <w:b/>
-          <w:bCs w:val="0"/>
-        </w:rPr>
-        <w:t>Zenhub</w:t>
-      </w:r>
-      <w:proofErr w:type="spellEnd"/>
-      <w:r>
-        <w:rPr>
-          <w:rFonts w:asciiTheme="minorHAnsi" w:hAnsiTheme="minorHAnsi" w:cstheme="minorHAnsi"/>
-          <w:b/>
-          <w:bCs w:val="0"/>
-        </w:rPr>
-        <w:t>) that shows your progress for the period of this report.</w:t>
+        <w:t>Include charts/graphs (e.g., burn down charts) from your project management tool (Github/Zenhub) that shows your progress for the period of this report.</w:t>
       </w:r>
     </w:p>
     <w:p>
@@ -2044,6 +2000,9 @@
         <w:jc w:val="center"/>
       </w:pPr>
       <w:r>
+        <w:rPr>
+          <w:noProof/>
+        </w:rPr>
         <w:drawing>
           <wp:inline distT="0" distB="0" distL="0" distR="0" wp14:anchorId="05F4F312" wp14:editId="2B1B46E3">
             <wp:extent cx="5943600" cy="3103245"/>
@@ -2425,18 +2384,8 @@
         <w:b w:val="0"/>
         <w:sz w:val="20"/>
       </w:rPr>
-      <w:t xml:space="preserve">Prepared by William </w:t>
+      <w:t>Prepared by William Pourmajidi</w:t>
     </w:r>
-    <w:proofErr w:type="spellStart"/>
-    <w:r>
-      <w:rPr>
-        <w:rFonts w:cstheme="minorHAnsi"/>
-        <w:b w:val="0"/>
-        <w:sz w:val="20"/>
-      </w:rPr>
-      <w:t>Pourmajidi</w:t>
-    </w:r>
-    <w:proofErr w:type="spellEnd"/>
   </w:p>
   <w:p>
     <w:pPr>
@@ -2472,18 +2421,8 @@
         <w:b w:val="0"/>
         <w:sz w:val="20"/>
       </w:rPr>
-      <w:t xml:space="preserve"> Vahid </w:t>
+      <w:t xml:space="preserve"> Vahid Hadavi</w:t>
     </w:r>
-    <w:proofErr w:type="spellStart"/>
-    <w:r>
-      <w:rPr>
-        <w:rFonts w:cstheme="minorHAnsi"/>
-        <w:b w:val="0"/>
-        <w:sz w:val="20"/>
-      </w:rPr>
-      <w:t>Hadavi</w:t>
-    </w:r>
-    <w:proofErr w:type="spellEnd"/>
     <w:r>
       <w:rPr>
         <w:rFonts w:cstheme="minorHAnsi"/>
@@ -5530,6 +5469,7 @@
   <w:style w:type="character" w:default="1" w:styleId="DefaultParagraphFont">
     <w:name w:val="Default Paragraph Font"/>
     <w:uiPriority w:val="1"/>
+    <w:semiHidden/>
     <w:unhideWhenUsed/>
   </w:style>
   <w:style w:type="table" w:default="1" w:styleId="TableNormal">

</xml_diff>